<commit_message>
Actualizar CV con certificado de Git y experiencia hasta agosto 2026
</commit_message>
<xml_diff>
--- a/assets/Luis_Sotelo_CV_QA_Automation_Engineer.docx
+++ b/assets/Luis_Sotelo_CV_QA_Automation_Engineer.docx
@@ -331,7 +331,7 @@
                 <w:sz w:val="18"/>
                 <w:szCs w:val="18"/>
               </w:rPr>
-              <w:t xml:space="preserve">- Automatización: Selenium WebDriver, Cucumber, Gherkin, Java, Serenity BDD, REST Assured, Postman, Bruno, Karate Framework, Maven y Git.</w:t>
+              <w:t>- Automatización: Selenium WebDriver, Cucumber, Gherkin, Java, Serenity BDD, REST Assured, Postman, Bruno, conocimientos de Karate Framework, Maven y Git.</w:t>
             </w:r>
           </w:p>
           <w:p>
@@ -503,97 +503,97 @@
                 <w:sz w:val="17"/>
                 <w:szCs w:val="17"/>
               </w:rPr>
-              <w:t xml:space="preserve">Lima, Perú | Sep 2025 - Actualidad</w:t>
-            </w:r>
-          </w:p>
-          <w:p>
-            <w:pPr>
-              <w:spacing w:after="40"/>
-              <w:ind w:left="220"/>
-            </w:pPr>
-            <w:r>
-              <w:rPr>
-                <w:rFonts w:ascii="Verdana" w:hAnsi="Verdana" w:cs="Verdana"/>
-                <w:color w:val="666666"/>
-                <w:sz w:val="18"/>
-                <w:szCs w:val="18"/>
-              </w:rPr>
-              <w:t xml:space="preserve">- Analizo requerimientos funcionales, historias de usuario y reglas de negocio para asegurar cobertura de pruebas funcionales, integración, regresión y validaciones no funcionales.</w:t>
-            </w:r>
-          </w:p>
-          <w:p>
-            <w:pPr>
-              <w:spacing w:after="40"/>
-              <w:ind w:left="220"/>
-            </w:pPr>
-            <w:r>
-              <w:rPr>
-                <w:rFonts w:ascii="Verdana" w:hAnsi="Verdana" w:cs="Verdana"/>
-                <w:color w:val="666666"/>
-                <w:sz w:val="18"/>
-                <w:szCs w:val="18"/>
-              </w:rPr>
-              <w:t xml:space="preserve">- Diseño, ejecuto y documento casos de prueba, evidencias, defectos, retests y ciclos de certificación mediante Jira y Xray.</w:t>
-            </w:r>
-          </w:p>
-          <w:p>
-            <w:pPr>
-              <w:spacing w:after="40"/>
-              <w:ind w:left="220"/>
-            </w:pPr>
-            <w:r>
-              <w:rPr>
-                <w:rFonts w:ascii="Verdana" w:hAnsi="Verdana" w:cs="Verdana"/>
-                <w:color w:val="666666"/>
-                <w:sz w:val="18"/>
-                <w:szCs w:val="18"/>
-              </w:rPr>
-              <w:t xml:space="preserve">- Valido APIs REST, JSON, reglas de negocio bancarias y procesos backend utilizando Bruno, Postman y herramientas de soporte técnico.</w:t>
-            </w:r>
-          </w:p>
-          <w:p>
-            <w:pPr>
-              <w:spacing w:after="40"/>
-              <w:ind w:left="220"/>
-            </w:pPr>
-            <w:r>
-              <w:rPr>
-                <w:rFonts w:ascii="Verdana" w:hAnsi="Verdana" w:cs="Verdana"/>
-                <w:color w:val="666666"/>
-                <w:sz w:val="18"/>
-                <w:szCs w:val="18"/>
-              </w:rPr>
-              <w:t xml:space="preserve">- Automatizo y mantengo scripts de prueba con Java, Selenium WebDriver, Cucumber, Gherkin, Maven y Git, dando soporte a frameworks automatizados existentes.</w:t>
-            </w:r>
-          </w:p>
-          <w:p>
-            <w:pPr>
-              <w:spacing w:after="40"/>
-              <w:ind w:left="220"/>
-            </w:pPr>
-            <w:r>
-              <w:rPr>
-                <w:rFonts w:ascii="Verdana" w:hAnsi="Verdana" w:cs="Verdana"/>
-                <w:color w:val="666666"/>
-                <w:sz w:val="18"/>
-                <w:szCs w:val="18"/>
-              </w:rPr>
-              <w:t xml:space="preserve">- Valido información y procesos en sistemas Core Banking mediante Host PC 3270, TSO y Nacar, enfocado en productos de cuentas.</w:t>
-            </w:r>
-          </w:p>
-          <w:p>
-            <w:pPr>
-              <w:spacing w:after="40"/>
-              <w:ind w:left="220"/>
-            </w:pPr>
-            <w:r>
-              <w:rPr>
-                <w:rFonts w:ascii="Verdana" w:hAnsi="Verdana" w:cs="Verdana"/>
-                <w:color w:val="666666"/>
-                <w:sz w:val="18"/>
-                <w:szCs w:val="18"/>
-              </w:rPr>
-              <w:t xml:space="preserve">- Coordino con equipos de desarrollo, arquitectura, negocio y QA para validar entregables, gestionar incidencias, preparar despliegues y participar en ceremonias Scrum.</w:t>
+              <w:t>Lima, Perú | Sep 2025 - Ago 2026</w:t>
+            </w:r>
+          </w:p>
+          <w:p>
+            <w:pPr>
+              <w:spacing w:after="40"/>
+              <w:ind w:left="220"/>
+            </w:pPr>
+            <w:r>
+              <w:rPr>
+                <w:rFonts w:ascii="Verdana" w:hAnsi="Verdana" w:cs="Verdana"/>
+                <w:color w:val="666666"/>
+                <w:sz w:val="18"/>
+                <w:szCs w:val="18"/>
+              </w:rPr>
+              <w:t>- Analicé requerimientos funcionales, historias de usuario y reglas de negocio para asegurar cobertura de pruebas funcionales, integración, regresión y validaciones no funcionales.</w:t>
+            </w:r>
+          </w:p>
+          <w:p>
+            <w:pPr>
+              <w:spacing w:after="40"/>
+              <w:ind w:left="220"/>
+            </w:pPr>
+            <w:r>
+              <w:rPr>
+                <w:rFonts w:ascii="Verdana" w:hAnsi="Verdana" w:cs="Verdana"/>
+                <w:color w:val="666666"/>
+                <w:sz w:val="18"/>
+                <w:szCs w:val="18"/>
+              </w:rPr>
+              <w:t>- Diseñé, ejecuté y documenté casos de prueba, evidencias, defectos, retests y ciclos de certificación mediante Jira y Xray.</w:t>
+            </w:r>
+          </w:p>
+          <w:p>
+            <w:pPr>
+              <w:spacing w:after="40"/>
+              <w:ind w:left="220"/>
+            </w:pPr>
+            <w:r>
+              <w:rPr>
+                <w:rFonts w:ascii="Verdana" w:hAnsi="Verdana" w:cs="Verdana"/>
+                <w:color w:val="666666"/>
+                <w:sz w:val="18"/>
+                <w:szCs w:val="18"/>
+              </w:rPr>
+              <w:t>- Validé APIs REST, JSON, reglas de negocio bancarias y procesos backend utilizando Bruno, Postman y herramientas de soporte técnico.</w:t>
+            </w:r>
+          </w:p>
+          <w:p>
+            <w:pPr>
+              <w:spacing w:after="40"/>
+              <w:ind w:left="220"/>
+            </w:pPr>
+            <w:r>
+              <w:rPr>
+                <w:rFonts w:ascii="Verdana" w:hAnsi="Verdana" w:cs="Verdana"/>
+                <w:color w:val="666666"/>
+                <w:sz w:val="18"/>
+                <w:szCs w:val="18"/>
+              </w:rPr>
+              <w:t>- Automaticé y mantuve scripts de prueba con Java, Selenium WebDriver, Cucumber, Gherkin, Maven y Git, dando soporte a frameworks automatizados existentes.</w:t>
+            </w:r>
+          </w:p>
+          <w:p>
+            <w:pPr>
+              <w:spacing w:after="40"/>
+              <w:ind w:left="220"/>
+            </w:pPr>
+            <w:r>
+              <w:rPr>
+                <w:rFonts w:ascii="Verdana" w:hAnsi="Verdana" w:cs="Verdana"/>
+                <w:color w:val="666666"/>
+                <w:sz w:val="18"/>
+                <w:szCs w:val="18"/>
+              </w:rPr>
+              <w:t>- Validé información y procesos en sistemas Core Banking mediante Host PC 3270, TSO y Nacar, con enfoque en productos de cuentas.</w:t>
+            </w:r>
+          </w:p>
+          <w:p>
+            <w:pPr>
+              <w:spacing w:after="40"/>
+              <w:ind w:left="220"/>
+            </w:pPr>
+            <w:r>
+              <w:rPr>
+                <w:rFonts w:ascii="Verdana" w:hAnsi="Verdana" w:cs="Verdana"/>
+                <w:color w:val="666666"/>
+                <w:sz w:val="18"/>
+                <w:szCs w:val="18"/>
+              </w:rPr>
+              <w:t>- Coordiné con equipos de desarrollo, arquitectura, negocio y QA para validar entregables, gestionar incidencias, preparar despliegues y participar en ceremonias Scrum.</w:t>
             </w:r>
           </w:p>
           <w:p>
@@ -958,7 +958,7 @@
                 <w:sz w:val="18"/>
                 <w:szCs w:val="18"/>
               </w:rPr>
-              <w:t xml:space="preserve">Testing y automatización: Selenium WebDriver, Cucumber, Gherkin, Serenity BDD, Karate Framework, Cypress, JUnit, REST Assured, Postman, Bruno, APIs REST, APIs SOAP, JSON, pruebas backend, pruebas funcionales, pruebas de integración, pruebas de regresión, UAT, certificación funcional.</w:t>
+              <w:t>Testing y automatización: Selenium WebDriver, Cucumber, Gherkin, Serenity BDD, Karate Framework (conocimientos), Cypress, JUnit, REST Assured, Postman, Bruno, APIs REST, APIs SOAP, JSON, pruebas backend, pruebas funcionales, pruebas de integración, pruebas de regresión, UAT, certificación funcional.</w:t>
             </w:r>
           </w:p>
           <w:p>
@@ -1143,6 +1143,21 @@
                 <w:szCs w:val="18"/>
               </w:rPr>
               <w:t xml:space="preserve">- ISTQB Certified Tester Foundation Level (CTFL) - En preparación.</w:t>
+            </w:r>
+          </w:p>
+          <w:p>
+            <w:pPr>
+              <w:spacing w:after="40"/>
+              <w:ind w:left="220"/>
+            </w:pPr>
+            <w:r>
+              <w:rPr>
+                <w:rFonts w:ascii="Verdana" w:hAnsi="Verdana" w:cs="Verdana"/>
+                <w:color w:val="666666"/>
+                <w:sz w:val="18"/>
+                <w:szCs w:val="18"/>
+              </w:rPr>
+              <w:t>- Udemy - GIT+GitHub: Todo un sistema de control de versiones de cero (ago 2026).</w:t>
             </w:r>
           </w:p>
           <w:p>

</xml_diff>

<commit_message>
Eliminar Karate del CV
</commit_message>
<xml_diff>
--- a/assets/Luis_Sotelo_CV_QA_Automation_Engineer.docx
+++ b/assets/Luis_Sotelo_CV_QA_Automation_Engineer.docx
@@ -331,7 +331,7 @@
                 <w:sz w:val="18"/>
                 <w:szCs w:val="18"/>
               </w:rPr>
-              <w:t>- Automatización: Selenium WebDriver, Cucumber, Gherkin, Java, Serenity BDD, REST Assured, Postman, Bruno, conocimientos de Karate Framework, Maven y Git.</w:t>
+              <w:t>- Automatización: Selenium WebDriver, Cucumber, Gherkin, Java, Serenity BDD, REST Assured, Postman, Bruno, Maven y Git.</w:t>
             </w:r>
           </w:p>
           <w:p>
@@ -958,7 +958,7 @@
                 <w:sz w:val="18"/>
                 <w:szCs w:val="18"/>
               </w:rPr>
-              <w:t>Testing y automatización: Selenium WebDriver, Cucumber, Gherkin, Serenity BDD, Karate Framework (conocimientos), Cypress, JUnit, REST Assured, Postman, Bruno, APIs REST, APIs SOAP, JSON, pruebas backend, pruebas funcionales, pruebas de integración, pruebas de regresión, UAT, certificación funcional.</w:t>
+              <w:t>Testing y automatización: Selenium WebDriver, Cucumber, Gherkin, Serenity BDD, Cypress, JUnit, REST Assured, Postman, Bruno, APIs REST, APIs SOAP, JSON, pruebas backend, pruebas funcionales, pruebas de integración, pruebas de regresión, UAT, certificación funcional.</w:t>
             </w:r>
           </w:p>
           <w:p>

</xml_diff>

<commit_message>
Optimizar CV final en dos páginas
</commit_message>
<xml_diff>
--- a/assets/Luis_Sotelo_CV_QA_Automation_Engineer.docx
+++ b/assets/Luis_Sotelo_CV_QA_Automation_Engineer.docx
@@ -1117,7 +1117,7 @@
           </w:tcPr>
           <w:p>
             <w:pPr>
-              <w:spacing w:after="40"/>
+              <w:spacing w:after="0"/>
               <w:ind w:left="220"/>
             </w:pPr>
             <w:r>
@@ -1132,7 +1132,7 @@
           </w:p>
           <w:p>
             <w:pPr>
-              <w:spacing w:after="40"/>
+              <w:spacing w:after="0"/>
               <w:ind w:left="220"/>
             </w:pPr>
             <w:r>
@@ -1147,7 +1147,7 @@
           </w:p>
           <w:p>
             <w:pPr>
-              <w:spacing w:after="40"/>
+              <w:spacing w:after="0"/>
               <w:ind w:left="220"/>
             </w:pPr>
             <w:r>
@@ -1162,7 +1162,7 @@
           </w:p>
           <w:p>
             <w:pPr>
-              <w:spacing w:after="40"/>
+              <w:spacing w:after="0"/>
               <w:ind w:left="220"/>
             </w:pPr>
             <w:r>
@@ -1177,7 +1177,7 @@
           </w:p>
           <w:p>
             <w:pPr>
-              <w:spacing w:after="40"/>
+              <w:spacing w:after="0"/>
               <w:ind w:left="220"/>
             </w:pPr>
             <w:r>
@@ -1192,7 +1192,7 @@
           </w:p>
           <w:p>
             <w:pPr>
-              <w:spacing w:after="40"/>
+              <w:spacing w:after="0"/>
               <w:ind w:left="220"/>
             </w:pPr>
             <w:r>
@@ -1207,7 +1207,7 @@
           </w:p>
           <w:p>
             <w:pPr>
-              <w:spacing w:after="40"/>
+              <w:spacing w:after="0"/>
               <w:ind w:left="220"/>
             </w:pPr>
             <w:r>
@@ -1222,7 +1222,7 @@
           </w:p>
           <w:p>
             <w:pPr>
-              <w:spacing w:after="40"/>
+              <w:spacing w:after="0"/>
               <w:ind w:left="220"/>
             </w:pPr>
             <w:r>
@@ -1237,7 +1237,7 @@
           </w:p>
           <w:p>
             <w:pPr>
-              <w:spacing w:after="40"/>
+              <w:spacing w:after="0"/>
               <w:ind w:left="220"/>
             </w:pPr>
             <w:r>
@@ -1252,7 +1252,7 @@
           </w:p>
           <w:p>
             <w:pPr>
-              <w:spacing w:after="40"/>
+              <w:spacing w:after="0"/>
               <w:ind w:left="220"/>
             </w:pPr>
             <w:r>
@@ -1273,7 +1273,7 @@
         <w:pBdr>
           <w:bottom w:val="single" w:sz="8" w:space="4" w:color="C9C9C9"/>
         </w:pBdr>
-        <w:spacing w:before="120" w:after="100"/>
+        <w:spacing w:before="0" w:after="0"/>
       </w:pPr>
       <w:r>
         <w:rPr>
@@ -1316,7 +1316,7 @@
           </w:tcPr>
           <w:p>
             <w:pPr>
-              <w:spacing w:after="40"/>
+              <w:spacing w:after="0"/>
               <w:ind w:left="220"/>
             </w:pPr>
             <w:r>
@@ -1331,7 +1331,7 @@
           </w:p>
           <w:p>
             <w:pPr>
-              <w:spacing w:after="40"/>
+              <w:spacing w:after="0"/>
               <w:ind w:left="220"/>
             </w:pPr>
             <w:r>
@@ -1346,7 +1346,7 @@
           </w:p>
           <w:p>
             <w:pPr>
-              <w:spacing w:after="40"/>
+              <w:spacing w:after="0"/>
               <w:ind w:left="220"/>
             </w:pPr>
             <w:r>

</xml_diff>

<commit_message>
Finalizar CV corregido en dos páginas
</commit_message>
<xml_diff>
--- a/assets/Luis_Sotelo_CV_QA_Automation_Engineer.docx
+++ b/assets/Luis_Sotelo_CV_QA_Automation_Engineer.docx
@@ -906,7 +906,7 @@
         <w:pBdr>
           <w:bottom w:val="single" w:sz="8" w:space="4" w:color="C9C9C9"/>
         </w:pBdr>
-        <w:spacing w:before="120" w:after="100"/>
+        <w:spacing w:before="60" w:after="40"/>
       </w:pPr>
       <w:r>
         <w:rPr>
@@ -949,7 +949,7 @@
           </w:tcPr>
           <w:p>
             <w:pPr>
-              <w:spacing w:after="70" w:line="240" w:lineRule="auto"/>
+              <w:spacing w:after="0" w:line="240" w:lineRule="auto"/>
             </w:pPr>
             <w:r>
               <w:rPr>
@@ -963,7 +963,7 @@
           </w:p>
           <w:p>
             <w:pPr>
-              <w:spacing w:after="70" w:line="240" w:lineRule="auto"/>
+              <w:spacing w:after="0" w:line="240" w:lineRule="auto"/>
             </w:pPr>
             <w:r>
               <w:rPr>
@@ -977,7 +977,7 @@
           </w:p>
           <w:p>
             <w:pPr>
-              <w:spacing w:after="70" w:line="240" w:lineRule="auto"/>
+              <w:spacing w:after="0" w:line="240" w:lineRule="auto"/>
             </w:pPr>
             <w:r>
               <w:rPr>
@@ -991,7 +991,7 @@
           </w:p>
           <w:p>
             <w:pPr>
-              <w:spacing w:after="70" w:line="240" w:lineRule="auto"/>
+              <w:spacing w:after="0" w:line="240" w:lineRule="auto"/>
             </w:pPr>
             <w:r>
               <w:rPr>
@@ -1011,7 +1011,7 @@
         <w:pBdr>
           <w:bottom w:val="single" w:sz="8" w:space="4" w:color="C9C9C9"/>
         </w:pBdr>
-        <w:spacing w:before="120" w:after="100"/>
+        <w:spacing w:before="60" w:after="40"/>
       </w:pPr>
       <w:r>
         <w:rPr>
@@ -1074,7 +1074,7 @@
         <w:pBdr>
           <w:bottom w:val="single" w:sz="8" w:space="4" w:color="C9C9C9"/>
         </w:pBdr>
-        <w:spacing w:before="120" w:after="100"/>
+        <w:spacing w:before="60" w:after="40"/>
       </w:pPr>
       <w:r>
         <w:rPr>

</xml_diff>

<commit_message>
Ajustar conocimientos técnicos del CV
</commit_message>
<xml_diff>
--- a/assets/Luis_Sotelo_CV_QA_Automation_Engineer.docx
+++ b/assets/Luis_Sotelo_CV_QA_Automation_Engineer.docx
@@ -958,7 +958,7 @@
                 <w:sz w:val="18"/>
                 <w:szCs w:val="18"/>
               </w:rPr>
-              <w:t>Testing y automatización: Selenium WebDriver, Cucumber, Gherkin, Serenity BDD, Cypress, JUnit, REST Assured, Postman, Bruno, APIs REST, APIs SOAP, JSON, pruebas backend, pruebas funcionales, pruebas de integración, pruebas de regresión, UAT, certificación funcional.</w:t>
+              <w:t>Testing y automatización: Selenium WebDriver, Cucumber, Gherkin, Serenity BDD, JUnit, REST Assured, Postman, Bruno, APIs REST, APIs SOAP, JSON, pruebas backend, pruebas funcionales, pruebas de integración, pruebas de regresión, UAT, certificación funcional.</w:t>
             </w:r>
           </w:p>
           <w:p>
@@ -972,7 +972,7 @@
                 <w:sz w:val="18"/>
                 <w:szCs w:val="18"/>
               </w:rPr>
-              <w:t xml:space="preserve">Lenguajes y desarrollo: Java, JavaScript, TypeScript, SQL, Kotlin, C#, Node.js, React.js, React Native, Angular, LitElement, HTML, CSS, POO.</w:t>
+              <w:t>Lenguajes y desarrollo: Java, JavaScript, SQL, Kotlin, Angular, LitElement, HTML, CSS, POO.</w:t>
             </w:r>
           </w:p>
           <w:p>
@@ -986,7 +986,7 @@
                 <w:sz w:val="18"/>
                 <w:szCs w:val="18"/>
               </w:rPr>
-              <w:t xml:space="preserve">Herramientas y plataformas: Jira, Xray, Azure DevOps Test Plans, Confluence, Bitbucket, Git, GitHub, Maven, Jenkins, Linux, SonarQube, Terminal 3270, CICSCTOR, CICSTSTOR, TSO, Host PC 3270, Nacar.</w:t>
+              <w:t>Herramientas y plataformas: Jira, Xray, Azure DevOps Test Plans, Bitbucket, Git, GitHub, Maven, Terminal 3270, CICSCTOR, CICSTSTOR, TSO, Host PC 3270, Nacar.</w:t>
             </w:r>
           </w:p>
           <w:p>

</xml_diff>